<commit_message>
feat: implement slice 7c design system and S3 polish
</commit_message>
<xml_diff>
--- a/docs/project-book.docx
+++ b/docs/project-book.docx
@@ -31,7 +31,7 @@
           <w:color w:val="5A5A5A"/>
           <w:sz w:val="28"/>
         </w:rPr>
-        <w:t>אפליקציית Web בעברית לניהול ליגות פרטיות של ניחושי תוצאות כדורגל</w:t>
+        <w:t>אפליקציית ווב בעברית לניהול ליגות פרטיות של ניחושי תוצאות כדורגל</w:t>
       </w:r>
     </w:p>
     <w:p>
@@ -48,7 +48,7 @@
           <w:color w:val="2E74B5"/>
           <w:sz w:val="32"/>
         </w:rPr>
-        <w:t>החלטת היקף מעודכנת</w:t>
+        <w:t>מיקוד גרסת הקורס</w:t>
       </w:r>
     </w:p>
     <w:p>
@@ -63,7 +63,7 @@
           <w:b w:val="0"/>
           <w:sz w:val="22"/>
         </w:rPr>
-        <w:t>בשל הזמן שנותר עד ההגשה ב־6 בספטמבר 2026, היקף ה־MVP צומצם לליבת המוצר. ההחלטה מצמצמת סיכון חיצוני וחוסכת פיתוח של ספק נוסף, cache, מכסות, אבטחה ובדיקות, וכך מאפשרת להשלים את תוצרי הקורס באיכות הנדרשת.</w:t>
+        <w:t>בשל הזמן שנותר עד ההגשה ב־6 בספטמבר 2026, גרסת הקורס ממוקדת בליבת המוצר ובתוצרי הקורס. ההחלטה מצמצמת סיכון חיצוני ומאפשרת להשלים את הזרימות, האבטחה, העיצוב והבדיקות באיכות הנדרשת.</w:t>
       </w:r>
     </w:p>
     <w:p>
@@ -79,7 +79,7 @@
           <w:color w:val="1F4D78"/>
           <w:sz w:val="22"/>
         </w:rPr>
-        <w:t>המערכת לא תכלול טקסט מחולל, ניתוח משחקים באמצעות מודל, מפתח ספק מודלים, Route ייעודי או טבלת cache. מסך המשחק ימשיך להציג נתונים שמורים ומאומתים בלבד.</w:t>
+        <w:t>מסך המשחק מציג נתונים שמורים ומאומתים בלבד. אין במוצר שירות חיצוני נוסף שאינו נדרש לליבת ליגת הניחושים.</w:t>
       </w:r>
     </w:p>
     <w:p>
@@ -111,7 +111,7 @@
           <w:b w:val="0"/>
           <w:sz w:val="22"/>
         </w:rPr>
-        <w:t>Predictor1 מרכזת תהליך שנוהל ידנית: יצירת ליגה, הזמנה, בקשת הצטרפות, אסמכתאת Demo פרטית, אישור, ניחוש לפני נעילה, תוצאה, ניקוד, דירוג ודוח חלוקת פרסים. המערכת אינה מחזיקה או מעבירה כסף.</w:t>
+        <w:t>המערכת מרכזת תהליך שנוהל ידנית: יצירת ליגה, הזמנה, בקשת הצטרפות, אסמכתאת הדגמה פרטית, אישור, ניחוש לפני נעילה, תוצאה, ניקוד, דירוג ודוח חלוקת פרסים. המערכת אינה מחזיקה או מעבירה כסף.</w:t>
       </w:r>
     </w:p>
     <w:p>
@@ -128,7 +128,7 @@
           <w:color w:val="2E74B5"/>
           <w:sz w:val="32"/>
         </w:rPr>
-        <w:t>היקף ה־MVP</w:t>
+        <w:t>היקף גרסת הקורס</w:t>
       </w:r>
     </w:p>
     <w:p>
@@ -145,7 +145,7 @@
           <w:b w:val="0"/>
           <w:sz w:val="22"/>
         </w:rPr>
-        <w:t>Supabase Auth ופרופיל בסיסי.</w:t>
+        <w:t>אימות משתמשים ופרופיל בסיסי.</w:t>
       </w:r>
     </w:p>
     <w:p>
@@ -162,7 +162,7 @@
           <w:b w:val="0"/>
           <w:sz w:val="22"/>
         </w:rPr>
-        <w:t>ליגות פרטיות, חוקי ניקוד 3/1/0 וחלוקת פרסי Demo.</w:t>
+        <w:t>ליגות פרטיות, חוקי ניקוד 3/1/0 וחלוקת פרסים להדגמה.</w:t>
       </w:r>
     </w:p>
     <w:p>
@@ -196,7 +196,7 @@
           <w:b w:val="0"/>
           <w:sz w:val="22"/>
         </w:rPr>
-        <w:t>משחקים ותוצאות עם API-Football ומסלול ידני מחייב.</w:t>
+        <w:t>משחקים ותוצאות עם ספק ספורט חי ומסלול ידני מחייב.</w:t>
       </w:r>
     </w:p>
     <w:p>
@@ -230,7 +230,7 @@
           <w:b w:val="0"/>
           <w:sz w:val="22"/>
         </w:rPr>
-        <w:t>ניקוד דטרמיניסטי, דירוג, שוויון ודוחות Demo.</w:t>
+        <w:t>ניקוד דטרמיניסטי, דירוג, שוויון ודוחות הדגמה.</w:t>
       </w:r>
     </w:p>
     <w:p>
@@ -267,7 +267,7 @@
           <w:b w:val="0"/>
           <w:sz w:val="22"/>
         </w:rPr>
-        <w:t>המערכת היא Modular Monolith יחיד ב־Next.js 16 App Router על Vercel, עם TypeScript strict ו־Supabase PostgreSQL/Auth/Storage/Cron. קריאות נעשות ב־Server Components, מוטציות UI ב־Server Actions וכניסות HTTP ייעודיות ב־Route Handlers.</w:t>
+        <w:t>המערכת היא מונוליט מודולרי יחיד: הדפדפן, הממשק והשרת נשארים באותו יישום. קריאות נעשות ברכיבי שרת, שינויים בפעולות שרת וכניסות רשת בנתיבים ייעודיים. היישום נפרס בסביבת ענן ונשען על שירותי מסד נתונים, אימות, אחסון ותזמון.</w:t>
       </w:r>
     </w:p>
     <w:p>
@@ -284,7 +284,7 @@
           <w:b w:val="0"/>
           <w:sz w:val="22"/>
         </w:rPr>
-        <w:t>RLS והרשאות least privilege נוצרות עם כל טבלה חשופה.</w:t>
+        <w:t>אבטחת שורות והרשאות מזעריות נוצרות עם כל טבלה חשופה.</w:t>
       </w:r>
     </w:p>
     <w:p>
@@ -301,7 +301,7 @@
           <w:b w:val="0"/>
           <w:sz w:val="22"/>
         </w:rPr>
-        <w:t>המשתמש נגזר תמיד מן ה־session; אין אמון ב־user_id או role מהלקוח.</w:t>
+        <w:t>זהות המשתמש נגזרת תמיד מן ההתחברות; אין אמון במזהה או בתפקיד שמגיעים מהלקוח.</w:t>
       </w:r>
     </w:p>
     <w:p>
@@ -318,7 +318,7 @@
           <w:b w:val="0"/>
           <w:sz w:val="22"/>
         </w:rPr>
-        <w:t>נעילת ניחושים וניקוד נאכפים במסד הנתונים ובשעת UTC.</w:t>
+        <w:t>נעילת ניחושים וניקוד נאכפים במסד הנתונים לפי זמן אוניברסלי.</w:t>
       </w:r>
     </w:p>
     <w:p>
@@ -335,7 +335,7 @@
           <w:b w:val="0"/>
           <w:sz w:val="22"/>
         </w:rPr>
-        <w:t>אסמכתאות נשמרות ב־bucket פרטי ומוגשות בקישור חתום קצר רק לאחר הרשאת משאב.</w:t>
+        <w:t>אסמכתאות נשמרות במאגר פרטי ומוגשות בקישור חתום קצר רק לאחר הרשאת משאב.</w:t>
       </w:r>
     </w:p>
     <w:p>
@@ -352,7 +352,80 @@
           <w:b w:val="0"/>
           <w:sz w:val="22"/>
         </w:rPr>
-        <w:t>מפתח Sports ומפתח Cron הם server-only; אין בפרויקט מפתחות נוספים לספקים חיצוניים.</w:t>
+        <w:t>מפתחות הספורט והתזמון נשמרים בשרת בלבד ואינם נשלחים לדפדפן.</w:t>
+      </w:r>
+    </w:p>
+    <w:p>
+      <w:pPr>
+        <w:pStyle w:val="Heading1"/>
+        <w:bidi/>
+        <w:spacing w:before="320" w:after="160"/>
+        <w:jc w:val="right"/>
+      </w:pPr>
+      <w:r>
+        <w:rPr>
+          <w:rFonts w:ascii="Arial" w:hAnsi="Arial" w:cs="Arial"/>
+          <w:b/>
+          <w:color w:val="2E74B5"/>
+          <w:sz w:val="32"/>
+        </w:rPr>
+        <w:t>שלב 7ג — מערכת עיצוב ורענון ממשק</w:t>
+      </w:r>
+    </w:p>
+    <w:p>
+      <w:pPr>
+        <w:bidi/>
+        <w:spacing w:after="120" w:line="264" w:lineRule="auto"/>
+        <w:jc w:val="right"/>
+      </w:pPr>
+      <w:r>
+        <w:t>לאחר סגירת בדיקת הקנרי בסביבה המארחת ולפני דוחות ההדגמה, המוצר קיבל שפה חזותית עברית אחידה מימין לשמאל. הכיוון שיושם הוא לוח שליטה ספורטיבי בהיר: טיפוגרפיה חזקה, היררכיית נתונים ברורה, כרטיס מחזור כרכיב חתימה ומשטח כהה מוגבל ללוח תוצאות.</w:t>
+      </w:r>
+    </w:p>
+    <w:p>
+      <w:pPr>
+        <w:pStyle w:val="ListBullet"/>
+        <w:bidi/>
+        <w:spacing w:after="160" w:line="280" w:lineRule="auto"/>
+        <w:ind w:left="720" w:hanging="360"/>
+        <w:jc w:val="right"/>
+      </w:pPr>
+      <w:r>
+        <w:t>יושמו ארבעת מסכי העוגן: לוח אישי, תקציר ליגה, משחקים וניחושים וטבלת דירוג. ביקורת ההמשך חיזקה ניגודיות, מצבי טעינה, תוצאות מבודדות מימין לשמאל ויעדי מגע; המסכים נבדקו ברוחבי 390, 768 ו־1440 פיקסלים.</w:t>
+      </w:r>
+    </w:p>
+    <w:p>
+      <w:pPr>
+        <w:pStyle w:val="ListBullet"/>
+        <w:bidi/>
+        <w:spacing w:after="160" w:line="280" w:lineRule="auto"/>
+        <w:ind w:left="720" w:hanging="360"/>
+        <w:jc w:val="right"/>
+      </w:pPr>
+      <w:r>
+        <w:rPr>
+          <w:rFonts w:ascii="Arial" w:hAnsi="Arial" w:cs="Arial"/>
+          <w:b w:val="0"/>
+          <w:sz w:val="22"/>
+        </w:rPr>
+        <w:t>אין שינוי בנתיבים, בסכמה, בהרשאות, בניקוד או בפונקציונליות.</w:t>
+      </w:r>
+    </w:p>
+    <w:p>
+      <w:pPr>
+        <w:pStyle w:val="ListBullet"/>
+        <w:bidi/>
+        <w:spacing w:after="160" w:line="280" w:lineRule="auto"/>
+        <w:ind w:left="720" w:hanging="360"/>
+        <w:jc w:val="right"/>
+      </w:pPr>
+      <w:r>
+        <w:rPr>
+          <w:rFonts w:ascii="Arial" w:hAnsi="Arial" w:cs="Arial"/>
+          <w:b w:val="0"/>
+          <w:sz w:val="22"/>
+        </w:rPr>
+        <w:t>אין שפה חזותית של הימורים, ערכת נושא כהה, אווטרים, פיד חברתי או תלות ממשק חדשה.</w:t>
       </w:r>
     </w:p>
     <w:p>
@@ -414,7 +487,7 @@
                 <w:color w:val="1F4D78"/>
                 <w:sz w:val="21"/>
               </w:rPr>
-              <w:t>Slice</w:t>
+              <w:t>שלב</w:t>
             </w:r>
           </w:p>
         </w:tc>
@@ -532,7 +605,7 @@
                 <w:b w:val="0"/>
                 <w:sz w:val="21"/>
               </w:rPr>
-              <w:t>תשתית, Auth, ליגות, הצטרפות, ניחושים, ניקוד ודירוג</w:t>
+              <w:t>תשתית, אימות, ליגות, הצטרפות, ניחושים, ניקוד ודירוג</w:t>
             </w:r>
           </w:p>
         </w:tc>
@@ -590,7 +663,7 @@
                 <w:b w:val="0"/>
                 <w:sz w:val="21"/>
               </w:rPr>
-              <w:t>7/7b</w:t>
+              <w:t>7/7ב</w:t>
             </w:r>
           </w:p>
         </w:tc>
@@ -618,7 +691,7 @@
                 <w:b w:val="0"/>
                 <w:sz w:val="21"/>
               </w:rPr>
-              <w:t>סנכרון ידני ו־API-Football</w:t>
+              <w:t>סנכרון ידני וספק ספורט חי</w:t>
             </w:r>
           </w:p>
         </w:tc>
@@ -646,7 +719,79 @@
                 <w:b w:val="0"/>
                 <w:sz w:val="21"/>
               </w:rPr>
-              <w:t>נמסר; hosted canary</w:t>
+              <w:t>נמסר; קנרי הושלם</w:t>
+            </w:r>
+          </w:p>
+        </w:tc>
+      </w:tr>
+      <w:tr>
+        <w:tc>
+          <w:tcPr>
+            <w:tcW w:type="dxa" w:w="1584"/>
+            <w:vAlign w:val="center"/>
+            <w:tcMar>
+              <w:top w:w="80" w:type="dxa"/>
+              <w:bottom w:w="80" w:type="dxa"/>
+              <w:start w:w="120" w:type="dxa"/>
+              <w:end w:w="120" w:type="dxa"/>
+            </w:tcMar>
+          </w:tcPr>
+          <w:p>
+            <w:pPr>
+              <w:bidi/>
+              <w:spacing w:after="0"/>
+              <w:jc w:val="right"/>
+            </w:pPr>
+            <w:r/>
+            <w:r>
+              <w:rPr>
+                <w:rFonts w:ascii="Arial" w:hAnsi="Arial" w:cs="Arial"/>
+                <w:b w:val="0"/>
+                <w:sz w:val="21"/>
+              </w:rPr>
+              <w:t>7ג</w:t>
+            </w:r>
+          </w:p>
+        </w:tc>
+        <w:tc>
+          <w:tcPr>
+            <w:tcW w:type="dxa" w:w="5616"/>
+            <w:vAlign w:val="center"/>
+            <w:tcMar>
+              <w:top w:w="80" w:type="dxa"/>
+              <w:bottom w:w="80" w:type="dxa"/>
+              <w:start w:w="120" w:type="dxa"/>
+              <w:end w:w="120" w:type="dxa"/>
+            </w:tcMar>
+          </w:tcPr>
+          <w:p>
+            <w:pPr>
+              <w:jc w:val="right"/>
+              <w:bidi/>
+            </w:pPr>
+            <w:r>
+              <w:t>מערכת עיצוב ורענון ממשק</w:t>
+            </w:r>
+          </w:p>
+        </w:tc>
+        <w:tc>
+          <w:tcPr>
+            <w:tcW w:type="dxa" w:w="2160"/>
+            <w:vAlign w:val="center"/>
+            <w:tcMar>
+              <w:top w:w="80" w:type="dxa"/>
+              <w:bottom w:w="80" w:type="dxa"/>
+              <w:start w:w="120" w:type="dxa"/>
+              <w:end w:w="120" w:type="dxa"/>
+            </w:tcMar>
+          </w:tcPr>
+          <w:p>
+            <w:pPr>
+              <w:jc w:val="right"/>
+              <w:bidi/>
+            </w:pPr>
+            <w:r>
+              <w:t>המימוש המקומי הושלם; ממתין ל־Preview</w:t>
             </w:r>
           </w:p>
         </w:tc>
@@ -693,18 +838,11 @@
           </w:tcPr>
           <w:p>
             <w:pPr>
+              <w:jc w:val="right"/>
               <w:bidi/>
-              <w:spacing w:after="0"/>
-              <w:jc w:val="right"/>
             </w:pPr>
-            <w:r/>
             <w:r>
-              <w:rPr>
-                <w:rFonts w:ascii="Arial" w:hAnsi="Arial" w:cs="Arial"/>
-                <w:b w:val="0"/>
-                <w:sz w:val="21"/>
-              </w:rPr>
-              <w:t>דוחות Demo</w:t>
+              <w:t>דוחות הדגמה</w:t>
             </w:r>
           </w:p>
         </w:tc>
@@ -721,17 +859,10 @@
           </w:tcPr>
           <w:p>
             <w:pPr>
+              <w:jc w:val="right"/>
               <w:bidi/>
-              <w:spacing w:after="0"/>
-              <w:jc w:val="right"/>
             </w:pPr>
-            <w:r/>
             <w:r>
-              <w:rPr>
-                <w:rFonts w:ascii="Arial" w:hAnsi="Arial" w:cs="Arial"/>
-                <w:b w:val="0"/>
-                <w:sz w:val="21"/>
-              </w:rPr>
               <w:t>השלב הבא</w:t>
             </w:r>
           </w:p>
@@ -790,7 +921,7 @@
                 <w:b w:val="0"/>
                 <w:sz w:val="21"/>
               </w:rPr>
-              <w:t>Hardening, מסמכים, פריסה והצגה</w:t>
+              <w:t>הקשחה, מסמכים, פריסה והצגה</w:t>
             </w:r>
           </w:p>
         </w:tc>
@@ -826,6 +957,24 @@
     </w:tbl>
     <w:p>
       <w:pPr>
+        <w:jc w:val="right"/>
+        <w:bidi/>
+      </w:pPr>
+      <w:r>
+        <w:t>אימות: lint, בדיקת טיפוסים, 460 בדיקות יחידה, 646 בדיקות מסד נתונים, build ו־20 תרחישי Playwright בדסקטופ וב־Pixel 5 עברו. הבנייה עם sentinel אישרה שסודות שרת אינם מגיעים לתוצרי הדפדפן. כיוון מימין לשמאל, Heebo והיעדר גלילה אופקית נבדקו ברוחבי 390, 768 ו־1440 פיקסלים.</w:t>
+      </w:r>
+    </w:p>
+    <w:p>
+      <w:pPr>
+        <w:jc w:val="right"/>
+        <w:bidi/>
+      </w:pPr>
+      <w:r>
+        <w:t>המימוש המקומי של שלב 7ג הושלם: מעטפת האפליקציה, Design Tokens, גופן Heebo, רכיבי מצבים משותפים וארבעת מסכי העוגן יושמו. עריכת הניחוש נשארה בנתיב הקיים, ללא שינוי בסכמה, בהרשאות או בחוקים העסקיים. נדרשים עדיין Preview ואישור חזותי לפני פריסת Production.</w:t>
+      </w:r>
+    </w:p>
+    <w:p>
+      <w:pPr>
         <w:pStyle w:val="Heading1"/>
         <w:bidi/>
         <w:spacing w:before="320" w:after="160"/>
@@ -855,7 +1004,7 @@
           <w:b w:val="0"/>
           <w:sz w:val="22"/>
         </w:rPr>
-        <w:t>הזרימה המרכזית ניתנת להדגמה מקצה לקצה ב־Vercel.</w:t>
+        <w:t>הזרימה המרכזית ניתנת להדגמה מקצה לקצה בפריסה הציבורית.</w:t>
       </w:r>
     </w:p>
     <w:p>
@@ -923,7 +1072,7 @@
           <w:b w:val="0"/>
           <w:sz w:val="22"/>
         </w:rPr>
-        <w:t>הממשק עבר בדיקת RTL, מובייל ונגישות בסיסית.</w:t>
+        <w:t>הממשק עבר בדיקת כיוון מימין לשמאל, מובייל ונגישות בסיסית.</w:t>
       </w:r>
     </w:p>
     <w:p>
@@ -1050,7 +1199,7 @@
                 <w:color w:val="1F4D78"/>
                 <w:sz w:val="21"/>
               </w:rPr>
-              <w:t>Definition of Done</w:t>
+              <w:t>תנאי סיום</w:t>
             </w:r>
           </w:p>
         </w:tc>
@@ -1080,7 +1229,7 @@
                 <w:b w:val="0"/>
                 <w:sz w:val="21"/>
               </w:rPr>
-              <w:t>24–28 באוגוסט</w:t>
+              <w:t>עד 24 באוגוסט</w:t>
             </w:r>
           </w:p>
         </w:tc>
@@ -1108,7 +1257,7 @@
                 <w:b w:val="0"/>
                 <w:sz w:val="21"/>
               </w:rPr>
-              <w:t>Hosted canary וסגירת Slice 7b</w:t>
+              <w:t>שלבים 0–7ב ובדיקת קנרי</w:t>
             </w:r>
           </w:p>
         </w:tc>
@@ -1136,7 +1285,87 @@
                 <w:b w:val="0"/>
                 <w:sz w:val="21"/>
               </w:rPr>
-              <w:t>סנכרון עובד ב־Preview/Production ומסלול ידני נשמר</w:t>
+              <w:t>הושלמו; ניסיון חוזר ללא שינוי ותזמון פעיל</w:t>
+            </w:r>
+          </w:p>
+        </w:tc>
+      </w:tr>
+      <w:tr>
+        <w:tc>
+          <w:tcPr>
+            <w:tcW w:type="dxa" w:w="2304"/>
+            <w:vAlign w:val="center"/>
+            <w:tcMar>
+              <w:top w:w="80" w:type="dxa"/>
+              <w:bottom w:w="80" w:type="dxa"/>
+              <w:start w:w="120" w:type="dxa"/>
+              <w:end w:w="120" w:type="dxa"/>
+            </w:tcMar>
+          </w:tcPr>
+          <w:p>
+            <w:pPr>
+              <w:bidi/>
+              <w:spacing w:after="0"/>
+              <w:jc w:val="right"/>
+            </w:pPr>
+            <w:r>
+              <w:t>24–25 באוגוסט</w:t>
+            </w:r>
+            <w:r>
+              <w:rPr>
+                <w:rFonts w:ascii="Arial" w:hAnsi="Arial" w:cs="Arial"/>
+                <w:b w:val="0"/>
+                <w:sz w:val="21"/>
+              </w:rPr>
+            </w:r>
+          </w:p>
+        </w:tc>
+        <w:tc>
+          <w:tcPr>
+            <w:tcW w:type="dxa" w:w="3168"/>
+            <w:vAlign w:val="center"/>
+            <w:tcMar>
+              <w:top w:w="80" w:type="dxa"/>
+              <w:bottom w:w="80" w:type="dxa"/>
+              <w:start w:w="120" w:type="dxa"/>
+              <w:end w:w="120" w:type="dxa"/>
+            </w:tcMar>
+          </w:tcPr>
+          <w:p>
+            <w:pPr>
+              <w:bidi/>
+              <w:spacing w:after="0"/>
+              <w:jc w:val="right"/>
+            </w:pPr>
+            <w:r/>
+            <w:r>
+              <w:rPr>
+                <w:rFonts w:ascii="Arial" w:hAnsi="Arial" w:cs="Arial"/>
+                <w:b w:val="0"/>
+                <w:sz w:val="21"/>
+              </w:rPr>
+              <w:t>שלב 7ג — מערכת עיצוב</w:t>
+            </w:r>
+          </w:p>
+        </w:tc>
+        <w:tc>
+          <w:tcPr>
+            <w:tcW w:type="dxa" w:w="3888"/>
+            <w:vAlign w:val="center"/>
+            <w:tcMar>
+              <w:top w:w="80" w:type="dxa"/>
+              <w:bottom w:w="80" w:type="dxa"/>
+              <w:start w:w="120" w:type="dxa"/>
+              <w:end w:w="120" w:type="dxa"/>
+            </w:tcMar>
+          </w:tcPr>
+          <w:p>
+            <w:pPr>
+              <w:jc w:val="right"/>
+              <w:bidi/>
+            </w:pPr>
+            <w:r>
+              <w:t>המימוש המקומי הושלם; Preview ואישור 390/768/1440 נדרשים לסגירה</w:t>
             </w:r>
           </w:p>
         </w:tc>
@@ -1166,7 +1395,7 @@
                 <w:b w:val="0"/>
                 <w:sz w:val="21"/>
               </w:rPr>
-              <w:t>29–30 באוגוסט</w:t>
+              <w:t>28–29 באוגוסט</w:t>
             </w:r>
           </w:p>
         </w:tc>
@@ -1194,7 +1423,7 @@
                 <w:b w:val="0"/>
                 <w:sz w:val="21"/>
               </w:rPr>
-              <w:t>Slice 8 — דוחות Demo</w:t>
+              <w:t>שלב 8 — דוחות הדגמה</w:t>
             </w:r>
           </w:p>
         </w:tc>
@@ -1222,7 +1451,7 @@
                 <w:b w:val="0"/>
                 <w:sz w:val="21"/>
               </w:rPr>
-              <w:t>נוסחאות approved/pending וחלוקת שוויון מכוסות בבדיקות</w:t>
+              <w:t>נוסחאות מאושר וממתין וחלוקת שוויון מכוסות בבדיקות</w:t>
             </w:r>
           </w:p>
         </w:tc>
@@ -1252,7 +1481,7 @@
                 <w:b w:val="0"/>
                 <w:sz w:val="21"/>
               </w:rPr>
-              <w:t>31 באוגוסט–3 בספטמבר</w:t>
+              <w:t>30.8–3.9</w:t>
             </w:r>
           </w:p>
         </w:tc>
@@ -1280,7 +1509,7 @@
                 <w:b w:val="0"/>
                 <w:sz w:val="21"/>
               </w:rPr>
-              <w:t>Slice 9 — Hardening</w:t>
+              <w:t>שלב 9 — הקשחה</w:t>
             </w:r>
           </w:p>
         </w:tc>
@@ -1308,7 +1537,7 @@
                 <w:b w:val="0"/>
                 <w:sz w:val="21"/>
               </w:rPr>
-              <w:t>E2E, נגישות, RTL, אבטחה, scale, README ופריסה</w:t>
+              <w:t>בדיקות מקצה לקצה, נגישות, אבטחה, מסמכים ופריסה</w:t>
             </w:r>
           </w:p>
         </w:tc>
@@ -1366,7 +1595,7 @@
                 <w:b w:val="0"/>
                 <w:sz w:val="21"/>
               </w:rPr>
-              <w:t>חזרה ותיקוני blocker</w:t>
+              <w:t>חזרה ותיקוני חסימה</w:t>
             </w:r>
           </w:p>
         </w:tc>
@@ -1480,7 +1709,7 @@
                 <w:b w:val="0"/>
                 <w:sz w:val="21"/>
               </w:rPr>
-              <w:t>קישור Vercel, GitHub, ספר פרויקט ומצגת</w:t>
+              <w:t>קישורי קוד ופריסה, ספר פרויקט ומצגת</w:t>
             </w:r>
           </w:p>
         </w:tc>
@@ -1517,7 +1746,7 @@
           <w:b w:val="0"/>
           <w:sz w:val="22"/>
         </w:rPr>
-        <w:t>טקסט מחולל או ספקי מודלים.</w:t>
+        <w:t>יכולות נוספות שאינן נדרשות לזרימות הליבה.</w:t>
       </w:r>
     </w:p>
     <w:p>
@@ -1551,7 +1780,7 @@
           <w:b w:val="0"/>
           <w:sz w:val="22"/>
         </w:rPr>
-        <w:t>אפליקציה Native, צ'אט, התראות או מנגנוני משחק נוספים.</w:t>
+        <w:t>אפליקציה ייעודית לטלפון, צ'אט, התראות או מנגנוני משחק נוספים.</w:t>
       </w:r>
     </w:p>
     <w:p>
@@ -1590,6 +1819,57 @@
     </w:p>
     <w:p>
       <w:pPr>
+        <w:pStyle w:val="ListBullet"/>
+        <w:bidi/>
+        <w:spacing w:after="160" w:line="280" w:lineRule="auto"/>
+        <w:ind w:left="720" w:hanging="360"/>
+        <w:jc w:val="right"/>
+      </w:pPr>
+      <w:r>
+        <w:rPr>
+          <w:rFonts w:ascii="Arial" w:hAnsi="Arial" w:cs="Arial"/>
+          <w:b w:val="0"/>
+          <w:sz w:val="22"/>
+        </w:rPr>
+        <w:t>אפיון המוצר: product.md.</w:t>
+      </w:r>
+    </w:p>
+    <w:p>
+      <w:pPr>
+        <w:pStyle w:val="ListBullet"/>
+        <w:bidi/>
+        <w:spacing w:after="160" w:line="280" w:lineRule="auto"/>
+        <w:ind w:left="720" w:hanging="360"/>
+        <w:jc w:val="right"/>
+      </w:pPr>
+      <w:r>
+        <w:rPr>
+          <w:rFonts w:ascii="Arial" w:hAnsi="Arial" w:cs="Arial"/>
+          <w:b w:val="0"/>
+          <w:sz w:val="22"/>
+        </w:rPr>
+        <w:t>גבולות הארכיטקטורה והאבטחה: architecture.md.</w:t>
+      </w:r>
+    </w:p>
+    <w:p>
+      <w:pPr>
+        <w:pStyle w:val="ListBullet"/>
+        <w:bidi/>
+        <w:spacing w:after="160" w:line="280" w:lineRule="auto"/>
+        <w:ind w:left="720" w:hanging="360"/>
+        <w:jc w:val="right"/>
+      </w:pPr>
+      <w:r>
+        <w:rPr>
+          <w:rFonts w:ascii="Arial" w:hAnsi="Arial" w:cs="Arial"/>
+          <w:b w:val="0"/>
+          <w:sz w:val="22"/>
+        </w:rPr>
+        <w:t>סדר המימוש והבדיקות: technical-plan.md.</w:t>
+      </w:r>
+    </w:p>
+    <w:p>
+      <w:pPr>
         <w:bidi/>
         <w:spacing w:after="120" w:line="264" w:lineRule="auto"/>
         <w:jc w:val="right"/>
@@ -1600,7 +1880,7 @@
           <w:b w:val="0"/>
           <w:sz w:val="22"/>
         </w:rPr>
-        <w:t>היקף המוצר: docs/product.md | גבולות ארכיטקטורה ואבטחה: docs/architecture.md | סדר מימוש ובדיקות: docs/technical-plan.md. במקרה של סתירה, מעדכנים את המקור הקנוני ואת הקוד באותו שינוי.</w:t>
+        <w:t>במקרה של סתירה, מעדכנים את המקור הקנוני ואת הקוד באותו שינוי.</w:t>
       </w:r>
     </w:p>
     <w:sectPr>
@@ -1630,7 +1910,7 @@
         <w:color w:val="5A5A5A"/>
         <w:sz w:val="17"/>
       </w:rPr>
-      <w:t>RUNI — טכנולוגיות אינטרנט 2026 | גרסה 1.0 | 24.8.2026</w:t>
+      <w:t>RUNI — טכנולוגיות אינטרנט 2026 | גרסה 1.1 | 24.8.2026</w:t>
     </w:r>
   </w:p>
 </w:ftr>

</xml_diff>

<commit_message>
docs: close slice 7c after preview approval
</commit_message>
<xml_diff>
--- a/docs/project-book.docx
+++ b/docs/project-book.docx
@@ -791,7 +791,7 @@
               <w:bidi/>
             </w:pPr>
             <w:r>
-              <w:t>המימוש המקומי הושלם; ממתין ל־Preview</w:t>
+              <w:t>הושלם; Preview אושר חזותית</w:t>
             </w:r>
           </w:p>
         </w:tc>
@@ -970,7 +970,7 @@
         <w:bidi/>
       </w:pPr>
       <w:r>
-        <w:t>המימוש המקומי של שלב 7ג הושלם: מעטפת האפליקציה, Design Tokens, גופן Heebo, רכיבי מצבים משותפים וארבעת מסכי העוגן יושמו. עריכת הניחוש נשארה בנתיב הקיים, ללא שינוי בסכמה, בהרשאות או בחוקים העסקיים. נדרשים עדיין Preview ואישור חזותי לפני פריסת Production.</w:t>
+        <w:t>שלב 7ג הושלם, נפרס ל־Preview ואושר חזותית ב־25 באוגוסט 2026: מעטפת האפליקציה, Design Tokens, גופן Heebo, רכיבי מצבים משותפים וארבעת מסכי העוגן יושמו. עריכת הניחוש נשארה בנתיב הקיים, ללא שינוי בסכמה, בהרשאות או בחוקים העסקיים. השלב הבא הוא שלב 8 — דוחות הדגמה.</w:t>
       </w:r>
     </w:p>
     <w:p>
@@ -1365,7 +1365,7 @@
               <w:bidi/>
             </w:pPr>
             <w:r>
-              <w:t>המימוש המקומי הושלם; Preview ואישור 390/768/1440 נדרשים לסגירה</w:t>
+              <w:t>הושלם; Preview ואישור 390/768/1440 עברו בהצלחה</w:t>
             </w:r>
           </w:p>
         </w:tc>

</xml_diff>

<commit_message>
docs: synchronize slice 9 submission package
</commit_message>
<xml_diff>
--- a/docs/project-book.docx
+++ b/docs/project-book.docx
@@ -98,7 +98,7 @@
           <w:sz w:val="22"/>
           <w:rtl w:val="0"/>
         </w:rPr>
-        <w:t>1.2</w:t>
+        <w:t>1.3</w:t>
       </w:r>
       <w:r>
         <w:rPr>
@@ -1515,7 +1515,31 @@
           <w:lang w:val="he-IL"/>
           <w:rtl w:val="1"/>
         </w:rPr>
-        <w:t xml:space="preserve"> היא הפרוסה הנוכחית: מימוש הליבה הושלם, והשלב הבא הוא סגירת שערי המסירה הסופיים בלי להרחיב את היקף המוצר.</w:t>
+        <w:t xml:space="preserve"> היא הפרוסה הנוכחית: מחזור החיים, ההקשחה וחבילת ההצגה מומשו. שערי מסירה אנושיים ו־</w:t>
+      </w:r>
+      <w:r>
+        <w:rPr>
+          <w:rFonts w:ascii="Arial" w:hAnsi="Arial" w:cs="Arial"/>
+          <w:lang w:val="he-IL"/>
+          <w:rtl w:val="0"/>
+        </w:rPr>
+        <w:t>Hosted</w:t>
+      </w:r>
+      <w:r>
+        <w:rPr>
+          <w:rFonts w:ascii="Arial" w:hAnsi="Arial" w:cs="Arial"/>
+          <w:lang w:val="he-IL"/>
+          <w:rtl w:val="1"/>
+        </w:rPr>
+        <w:t xml:space="preserve"> שאינם ניתנים לאוטומציה נשארים מפורשים ואינם מוצגים כ־</w:t>
+      </w:r>
+      <w:r>
+        <w:rPr>
+          <w:rFonts w:ascii="Arial" w:hAnsi="Arial" w:cs="Arial"/>
+          <w:lang w:val="he-IL"/>
+          <w:rtl w:val="0"/>
+        </w:rPr>
+        <w:t>PASS.</w:t>
       </w:r>
     </w:p>
     <w:tbl>
@@ -2539,7 +2563,7 @@
                 <w:sz w:val="18"/>
                 <w:rtl w:val="0"/>
               </w:rPr>
-              <w:t>624/624</w:t>
+              <w:t>627/627</w:t>
             </w:r>
             <w:r>
               <w:rPr>
@@ -2561,7 +2585,7 @@
                 <w:sz w:val="18"/>
                 <w:rtl w:val="0"/>
               </w:rPr>
-              <w:t>47</w:t>
+              <w:t>48</w:t>
             </w:r>
             <w:r>
               <w:rPr>
@@ -2658,7 +2682,7 @@
                 <w:sz w:val="18"/>
                 <w:rtl w:val="1"/>
               </w:rPr>
-              <w:t xml:space="preserve"> וה־</w:t>
+              <w:t>, מסמכי ההגשה וה־</w:t>
             </w:r>
             <w:r>
               <w:rPr>
@@ -5016,7 +5040,7 @@
             <w:u w:val="single"/>
             <w:rtl w:val="1"/>
           </w:rPr>
-          <w:t>הוראות הרצה והדגמה</w:t>
+          <w:t>מטריצת בדיקות</w:t>
         </w:r>
       </w:hyperlink>
     </w:p>
@@ -5034,6 +5058,114 @@
             <w:u w:val="single"/>
             <w:rtl w:val="1"/>
           </w:rPr>
+          <w:t>גבולות אבטחה</w:t>
+        </w:r>
+      </w:hyperlink>
+    </w:p>
+    <w:p>
+      <w:pPr>
+        <w:pStyle w:val="ListBullet"/>
+        <w:jc w:val="right"/>
+        <w:bidi/>
+      </w:pPr>
+      <w:hyperlink r:id="rId16">
+        <w:r>
+          <w:rPr>
+            <w:rFonts w:ascii="Arial" w:hAnsi="Arial" w:cs="Arial"/>
+            <w:color w:val="1769AA"/>
+            <w:u w:val="single"/>
+            <w:rtl w:val="1"/>
+          </w:rPr>
+          <w:t>קנה מידה</w:t>
+        </w:r>
+      </w:hyperlink>
+    </w:p>
+    <w:p>
+      <w:pPr>
+        <w:pStyle w:val="ListBullet"/>
+        <w:jc w:val="right"/>
+        <w:bidi/>
+      </w:pPr>
+      <w:hyperlink r:id="rId17">
+        <w:r>
+          <w:rPr>
+            <w:rFonts w:ascii="Arial" w:hAnsi="Arial" w:cs="Arial"/>
+            <w:color w:val="1769AA"/>
+            <w:u w:val="single"/>
+            <w:rtl w:val="1"/>
+          </w:rPr>
+          <w:t>פריסה ו־callbacks</w:t>
+        </w:r>
+      </w:hyperlink>
+    </w:p>
+    <w:p>
+      <w:pPr>
+        <w:pStyle w:val="ListBullet"/>
+        <w:jc w:val="right"/>
+        <w:bidi/>
+      </w:pPr>
+      <w:hyperlink r:id="rId18">
+        <w:r>
+          <w:rPr>
+            <w:rFonts w:ascii="Arial" w:hAnsi="Arial" w:cs="Arial"/>
+            <w:color w:val="1769AA"/>
+            <w:u w:val="single"/>
+            <w:rtl w:val="1"/>
+          </w:rPr>
+          <w:t>הוראות evaluator</w:t>
+        </w:r>
+      </w:hyperlink>
+    </w:p>
+    <w:p>
+      <w:pPr>
+        <w:pStyle w:val="ListBullet"/>
+        <w:jc w:val="right"/>
+        <w:bidi/>
+      </w:pPr>
+      <w:hyperlink r:id="rId19">
+        <w:r>
+          <w:rPr>
+            <w:rFonts w:ascii="Arial" w:hAnsi="Arial" w:cs="Arial"/>
+            <w:color w:val="1769AA"/>
+            <w:u w:val="single"/>
+            <w:rtl w:val="1"/>
+          </w:rPr>
+          <w:t>הוראות הרצה והדגמה</w:t>
+        </w:r>
+      </w:hyperlink>
+    </w:p>
+    <w:p>
+      <w:pPr>
+        <w:pStyle w:val="ListBullet"/>
+        <w:jc w:val="right"/>
+        <w:bidi/>
+      </w:pPr>
+      <w:hyperlink r:id="rId20">
+        <w:r>
+          <w:rPr>
+            <w:rFonts w:ascii="Arial" w:hAnsi="Arial" w:cs="Arial"/>
+            <w:color w:val="1769AA"/>
+            <w:u w:val="single"/>
+            <w:rtl w:val="1"/>
+          </w:rPr>
+          <w:t>חבילת המצגת</w:t>
+        </w:r>
+      </w:hyperlink>
+    </w:p>
+    <w:p>
+      <w:pPr>
+        <w:pStyle w:val="ListBullet"/>
+        <w:jc w:val="right"/>
+        <w:bidi/>
+      </w:pPr>
+      <w:hyperlink r:id="rId21">
+        <w:r>
+          <w:rPr>
+            <w:rFonts w:ascii="Arial" w:hAnsi="Arial" w:cs="Arial"/>
+            <w:color w:val="1769AA"/>
+            <w:u w:val="single"/>
+            <w:rtl w:val="1"/>
+          </w:rPr>
           <w:t>מאגר הקוד</w:t>
         </w:r>
       </w:hyperlink>
@@ -5044,7 +5176,7 @@
         <w:jc w:val="right"/>
         <w:bidi/>
       </w:pPr>
-      <w:hyperlink r:id="rId16">
+      <w:hyperlink r:id="rId22">
         <w:r>
           <w:rPr>
             <w:rFonts w:ascii="Arial" w:hAnsi="Arial" w:cs="Arial"/>
@@ -5604,7 +5736,7 @@
         <w:sz w:val="18"/>
         <w:rtl w:val="0"/>
       </w:rPr>
-      <w:t>v1.2</w:t>
+      <w:t>v1.3</w:t>
     </w:r>
     <w:r>
       <w:rPr>

</xml_diff>

<commit_message>
docs: assemble slice 9 review closeout
</commit_message>
<xml_diff>
--- a/docs/project-book.docx
+++ b/docs/project-book.docx
@@ -2563,7 +2563,7 @@
                 <w:sz w:val="18"/>
                 <w:rtl w:val="0"/>
               </w:rPr>
-              <w:t>627/627</w:t>
+              <w:t>PASS</w:t>
             </w:r>
             <w:r>
               <w:rPr>
@@ -2574,7 +2574,7 @@
                 <w:sz w:val="18"/>
                 <w:rtl w:val="1"/>
               </w:rPr>
-              <w:t xml:space="preserve"> ב־</w:t>
+              <w:t xml:space="preserve"> — מטריצת </w:t>
             </w:r>
             <w:r>
               <w:rPr>
@@ -2585,7 +2585,7 @@
                 <w:sz w:val="18"/>
                 <w:rtl w:val="0"/>
               </w:rPr>
-              <w:t>48</w:t>
+              <w:t>RULES</w:t>
             </w:r>
             <w:r>
               <w:rPr>
@@ -2596,7 +2596,7 @@
                 <w:sz w:val="18"/>
                 <w:rtl w:val="1"/>
               </w:rPr>
-              <w:t xml:space="preserve"> קבצים</w:t>
+              <w:t xml:space="preserve"> מלאה</w:t>
             </w:r>
           </w:p>
         </w:tc>
@@ -2779,7 +2779,7 @@
                 <w:sz w:val="18"/>
                 <w:rtl w:val="0"/>
               </w:rPr>
-              <w:t>1443/1443</w:t>
+              <w:t>PASS</w:t>
             </w:r>
             <w:r>
               <w:rPr>
@@ -2790,7 +2790,7 @@
                 <w:sz w:val="18"/>
                 <w:rtl w:val="1"/>
               </w:rPr>
-              <w:t xml:space="preserve"> ב־</w:t>
+              <w:t xml:space="preserve"> — מטריצת </w:t>
             </w:r>
             <w:r>
               <w:rPr>
@@ -2801,7 +2801,7 @@
                 <w:sz w:val="18"/>
                 <w:rtl w:val="0"/>
               </w:rPr>
-              <w:t>30</w:t>
+              <w:t>DATA</w:t>
             </w:r>
             <w:r>
               <w:rPr>
@@ -2812,7 +2812,7 @@
                 <w:sz w:val="18"/>
                 <w:rtl w:val="1"/>
               </w:rPr>
-              <w:t xml:space="preserve"> קבצים</w:t>
+              <w:t xml:space="preserve"> מלאה</w:t>
             </w:r>
           </w:p>
         </w:tc>
@@ -2995,7 +2995,40 @@
                 <w:sz w:val="18"/>
                 <w:rtl w:val="0"/>
               </w:rPr>
-              <w:t>28/28</w:t>
+              <w:t>PASS</w:t>
+            </w:r>
+            <w:r>
+              <w:rPr>
+                <w:rFonts w:ascii="Arial" w:hAnsi="Arial" w:cs="Arial"/>
+                <w:lang w:val="he-IL"/>
+                <w:b w:val="0"/>
+                <w:color w:val="202A35"/>
+                <w:sz w:val="18"/>
+                <w:rtl w:val="1"/>
+              </w:rPr>
+              <w:t xml:space="preserve"> — מטריצת </w:t>
+            </w:r>
+            <w:r>
+              <w:rPr>
+                <w:rFonts w:ascii="Arial" w:hAnsi="Arial" w:cs="Arial"/>
+                <w:lang w:val="he-IL"/>
+                <w:b w:val="0"/>
+                <w:color w:val="202A35"/>
+                <w:sz w:val="18"/>
+                <w:rtl w:val="0"/>
+              </w:rPr>
+              <w:t>FLOWS</w:t>
+            </w:r>
+            <w:r>
+              <w:rPr>
+                <w:rFonts w:ascii="Arial" w:hAnsi="Arial" w:cs="Arial"/>
+                <w:lang w:val="he-IL"/>
+                <w:b w:val="0"/>
+                <w:color w:val="202A35"/>
+                <w:sz w:val="18"/>
+                <w:rtl w:val="1"/>
+              </w:rPr>
+              <w:t xml:space="preserve"> מלאה</w:t>
             </w:r>
           </w:p>
         </w:tc>
@@ -3017,28 +3050,6 @@
               <w:jc w:val="right"/>
               <w:bidi/>
             </w:pPr>
-            <w:r>
-              <w:rPr>
-                <w:rFonts w:ascii="Arial" w:hAnsi="Arial" w:cs="Arial"/>
-                <w:lang w:val="he-IL"/>
-                <w:b w:val="0"/>
-                <w:color w:val="202A35"/>
-                <w:sz w:val="18"/>
-                <w:rtl w:val="0"/>
-              </w:rPr>
-              <w:t>14</w:t>
-            </w:r>
-            <w:r>
-              <w:rPr>
-                <w:rFonts w:ascii="Arial" w:hAnsi="Arial" w:cs="Arial"/>
-                <w:lang w:val="he-IL"/>
-                <w:b w:val="0"/>
-                <w:color w:val="202A35"/>
-                <w:sz w:val="18"/>
-                <w:rtl w:val="1"/>
-              </w:rPr>
-              <w:t xml:space="preserve"> תרחישים ב־</w:t>
-            </w:r>
             <w:r>
               <w:rPr>
                 <w:rFonts w:ascii="Arial" w:hAnsi="Arial" w:cs="Arial"/>
@@ -3081,7 +3092,7 @@
                 <w:sz w:val="18"/>
                 <w:rtl w:val="1"/>
               </w:rPr>
-              <w:t xml:space="preserve"> וב־</w:t>
+              <w:t xml:space="preserve"> ו־</w:t>
             </w:r>
             <w:r>
               <w:rPr>
@@ -3092,7 +3103,7 @@
                 <w:sz w:val="18"/>
                 <w:rtl w:val="0"/>
               </w:rPr>
-              <w:t>Pixel</w:t>
+              <w:t>Mobile</w:t>
             </w:r>
             <w:r>
               <w:rPr>
@@ -3114,7 +3125,7 @@
                 <w:sz w:val="18"/>
                 <w:rtl w:val="0"/>
               </w:rPr>
-              <w:t>5</w:t>
+              <w:t>Chromium</w:t>
             </w:r>
             <w:r>
               <w:rPr>
@@ -3209,9 +3220,9 @@
                 <w:b w:val="0"/>
                 <w:color w:val="202A35"/>
                 <w:sz w:val="18"/>
-                <w:rtl w:val="1"/>
+                <w:rtl w:val="0"/>
               </w:rPr>
-              <w:t xml:space="preserve">עבר; </w:t>
+              <w:t>PASS</w:t>
             </w:r>
             <w:r>
               <w:rPr>
@@ -3222,7 +3233,18 @@
                 <w:sz w:val="18"/>
                 <w:rtl w:val="0"/>
               </w:rPr>
-              <w:t>52</w:t>
+              <w:t xml:space="preserve"> — </w:t>
+            </w:r>
+            <w:r>
+              <w:rPr>
+                <w:rFonts w:ascii="Arial" w:hAnsi="Arial" w:cs="Arial"/>
+                <w:lang w:val="he-IL"/>
+                <w:b w:val="0"/>
+                <w:color w:val="202A35"/>
+                <w:sz w:val="18"/>
+                <w:rtl w:val="0"/>
+              </w:rPr>
+              <w:t>production</w:t>
             </w:r>
             <w:r>
               <w:rPr>
@@ -3244,7 +3266,7 @@
                 <w:sz w:val="18"/>
                 <w:rtl w:val="0"/>
               </w:rPr>
-              <w:t>artifacts</w:t>
+              <w:t>build</w:t>
             </w:r>
             <w:r>
               <w:rPr>
@@ -3255,7 +3277,29 @@
                 <w:sz w:val="18"/>
                 <w:rtl w:val="1"/>
               </w:rPr>
-              <w:t xml:space="preserve"> נסרקו</w:t>
+              <w:t xml:space="preserve"> וסריקת </w:t>
+            </w:r>
+            <w:r>
+              <w:rPr>
+                <w:rFonts w:ascii="Arial" w:hAnsi="Arial" w:cs="Arial"/>
+                <w:lang w:val="he-IL"/>
+                <w:b w:val="0"/>
+                <w:color w:val="202A35"/>
+                <w:sz w:val="18"/>
+                <w:rtl w:val="0"/>
+              </w:rPr>
+              <w:t>client</w:t>
+            </w:r>
+            <w:r>
+              <w:rPr>
+                <w:rFonts w:ascii="Arial" w:hAnsi="Arial" w:cs="Arial"/>
+                <w:lang w:val="he-IL"/>
+                <w:b w:val="0"/>
+                <w:color w:val="202A35"/>
+                <w:sz w:val="18"/>
+                <w:rtl w:val="1"/>
+              </w:rPr>
+              <w:t xml:space="preserve"> לא־ריקה</w:t>
             </w:r>
           </w:p>
         </w:tc>
@@ -3341,7 +3385,7 @@
                 <w:sz w:val="18"/>
                 <w:rtl w:val="1"/>
               </w:rPr>
-              <w:t xml:space="preserve"> וסריקה לא־ריקה להיעדר סודות בדפדפן</w:t>
+              <w:t xml:space="preserve"> והיעדר סודות בדפדפן</w:t>
             </w:r>
           </w:p>
         </w:tc>

</xml_diff>

<commit_message>
docs(slice-9): record owner manual gates
</commit_message>
<xml_diff>
--- a/docs/project-book.docx
+++ b/docs/project-book.docx
@@ -98,7 +98,7 @@
           <w:sz w:val="22"/>
           <w:rtl w:val="0"/>
         </w:rPr>
-        <w:t>1.3</w:t>
+        <w:t>1.4</w:t>
       </w:r>
       <w:r>
         <w:rPr>
@@ -120,7 +120,7 @@
           <w:sz w:val="22"/>
           <w:rtl w:val="0"/>
         </w:rPr>
-        <w:t>27</w:t>
+        <w:t>30</w:t>
       </w:r>
       <w:r>
         <w:rPr>
@@ -1515,7 +1515,7 @@
           <w:lang w:val="he-IL"/>
           <w:rtl w:val="1"/>
         </w:rPr>
-        <w:t xml:space="preserve"> היא הפרוסה הנוכחית: מחזור החיים, ההקשחה וחבילת ההצגה מומשו. שערי מסירה אנושיים ו־</w:t>
+        <w:t xml:space="preserve"> היא הפרוסה הנוכחית: מחזור החיים, ההקשחה וחבילת ההצגה מומשו. בדיקת </w:t>
       </w:r>
       <w:r>
         <w:rPr>
@@ -1523,7 +1523,7 @@
           <w:lang w:val="he-IL"/>
           <w:rtl w:val="0"/>
         </w:rPr>
-        <w:t>Hosted</w:t>
+        <w:t>Chrome</w:t>
       </w:r>
       <w:r>
         <w:rPr>
@@ -1531,7 +1531,74 @@
           <w:lang w:val="he-IL"/>
           <w:rtl w:val="1"/>
         </w:rPr>
-        <w:t xml:space="preserve"> שאינם ניתנים לאוטומציה נשארים מפורשים ואינם מוצגים כ־</w:t>
+        <w:t xml:space="preserve"> והחזרה נסגרו כ־</w:t>
+      </w:r>
+      <w:r>
+        <w:rPr>
+          <w:rFonts w:ascii="Consolas" w:hAnsi="Consolas" w:cs="Consolas"/>
+          <w:lang w:val="he-IL"/>
+          <w:color w:val="1F4E79"/>
+          <w:rtl w:val="0"/>
+        </w:rPr>
+        <w:t>OWNER_REPORTED</w:t>
+      </w:r>
+      <w:r>
+        <w:rPr>
+          <w:rFonts w:ascii="Consolas" w:hAnsi="Consolas" w:cs="Consolas"/>
+          <w:lang w:val="he-IL"/>
+          <w:color w:val="1F4E79"/>
+          <w:rtl w:val="0"/>
+        </w:rPr>
+        <w:t xml:space="preserve"> </w:t>
+      </w:r>
+      <w:r>
+        <w:rPr>
+          <w:rFonts w:ascii="Consolas" w:hAnsi="Consolas" w:cs="Consolas"/>
+          <w:lang w:val="he-IL"/>
+          <w:color w:val="1F4E79"/>
+          <w:rtl w:val="0"/>
+        </w:rPr>
+        <w:t>PASS</w:t>
+      </w:r>
+      <w:r>
+        <w:rPr>
+          <w:rFonts w:ascii="Arial" w:hAnsi="Arial" w:cs="Arial"/>
+          <w:lang w:val="he-IL"/>
+          <w:rtl w:val="1"/>
+        </w:rPr>
+        <w:t xml:space="preserve"> ללא תצפית </w:t>
+      </w:r>
+      <w:r>
+        <w:rPr>
+          <w:rFonts w:ascii="Arial" w:hAnsi="Arial" w:cs="Arial"/>
+          <w:lang w:val="he-IL"/>
+          <w:rtl w:val="0"/>
+        </w:rPr>
+        <w:t>agent</w:t>
+      </w:r>
+      <w:r>
+        <w:rPr>
+          <w:rFonts w:ascii="Arial" w:hAnsi="Arial" w:cs="Arial"/>
+          <w:lang w:val="he-IL"/>
+          <w:rtl w:val="1"/>
+        </w:rPr>
+        <w:t xml:space="preserve">; שלושת שערי </w:t>
+      </w:r>
+      <w:r>
+        <w:rPr>
+          <w:rFonts w:ascii="Arial" w:hAnsi="Arial" w:cs="Arial"/>
+          <w:lang w:val="he-IL"/>
+          <w:rtl w:val="0"/>
+        </w:rPr>
+        <w:t>Hosted/Production/Public</w:t>
+      </w:r>
+      <w:r>
+        <w:rPr>
+          <w:rFonts w:ascii="Arial" w:hAnsi="Arial" w:cs="Arial"/>
+          <w:lang w:val="he-IL"/>
+          <w:rtl w:val="1"/>
+        </w:rPr>
+        <w:t xml:space="preserve"> הסופיים נשארים מפורשים ואינם מוצגים כ־</w:t>
       </w:r>
       <w:r>
         <w:rPr>
@@ -1660,7 +1727,7 @@
                 <w:sz w:val="18"/>
                 <w:rtl w:val="0"/>
               </w:rPr>
-              <w:t>27.8.2026</w:t>
+              <w:t>30.8.2026</w:t>
             </w:r>
           </w:p>
         </w:tc>
@@ -3638,7 +3705,7 @@
           <w:lang w:val="he-IL"/>
           <w:rtl w:val="1"/>
         </w:rPr>
-        <w:t xml:space="preserve"> ללא גלילה אופקית. בדיקת </w:t>
+        <w:t xml:space="preserve"> ללא גלילה אופקית. ב־</w:t>
       </w:r>
       <w:r>
         <w:rPr>
@@ -3646,6 +3713,38 @@
           <w:lang w:val="he-IL"/>
           <w:rtl w:val="0"/>
         </w:rPr>
+        <w:t>30.8.2026</w:t>
+      </w:r>
+      <w:r>
+        <w:rPr>
+          <w:rFonts w:ascii="Arial" w:hAnsi="Arial" w:cs="Arial"/>
+          <w:lang w:val="he-IL"/>
+          <w:rtl w:val="1"/>
+        </w:rPr>
+        <w:t xml:space="preserve"> ה־</w:t>
+      </w:r>
+      <w:r>
+        <w:rPr>
+          <w:rFonts w:ascii="Arial" w:hAnsi="Arial" w:cs="Arial"/>
+          <w:lang w:val="he-IL"/>
+          <w:rtl w:val="0"/>
+        </w:rPr>
+        <w:t>owner</w:t>
+      </w:r>
+      <w:r>
+        <w:rPr>
+          <w:rFonts w:ascii="Arial" w:hAnsi="Arial" w:cs="Arial"/>
+          <w:lang w:val="he-IL"/>
+          <w:rtl w:val="1"/>
+        </w:rPr>
+        <w:t xml:space="preserve"> אישר </w:t>
+      </w:r>
+      <w:r>
+        <w:rPr>
+          <w:rFonts w:ascii="Arial" w:hAnsi="Arial" w:cs="Arial"/>
+          <w:lang w:val="he-IL"/>
+          <w:rtl w:val="0"/>
+        </w:rPr>
         <w:t>Chrome</w:t>
       </w:r>
       <w:r>
@@ -3678,31 +3777,96 @@
           <w:lang w:val="he-IL"/>
           <w:rtl w:val="0"/>
         </w:rPr>
+        <w:t>Zoom</w:t>
+      </w:r>
+      <w:r>
+        <w:rPr>
+          <w:rFonts w:ascii="Arial" w:hAnsi="Arial" w:cs="Arial"/>
+          <w:lang w:val="he-IL"/>
+          <w:rtl w:val="0"/>
+        </w:rPr>
+        <w:t>=</w:t>
+      </w:r>
+      <w:r>
+        <w:rPr>
+          <w:rFonts w:ascii="Arial" w:hAnsi="Arial" w:cs="Arial"/>
+          <w:lang w:val="he-IL"/>
+          <w:rtl w:val="0"/>
+        </w:rPr>
         <w:t>200</w:t>
       </w:r>
       <w:r>
         <w:rPr>
           <w:rFonts w:ascii="Arial" w:hAnsi="Arial" w:cs="Arial"/>
           <w:lang w:val="he-IL"/>
+          <w:rtl w:val="0"/>
+        </w:rPr>
+        <w:t xml:space="preserve">% </w:t>
+      </w:r>
+      <w:r>
+        <w:rPr>
+          <w:rFonts w:ascii="Arial" w:hAnsi="Arial" w:cs="Arial"/>
+          <w:lang w:val="he-IL"/>
+          <w:rtl w:val="0"/>
+        </w:rPr>
+        <w:t>PASS</w:t>
+      </w:r>
+      <w:r>
+        <w:rPr>
+          <w:rFonts w:ascii="Arial" w:hAnsi="Arial" w:cs="Arial"/>
+          <w:lang w:val="he-IL"/>
           <w:rtl w:val="1"/>
         </w:rPr>
-        <w:t xml:space="preserve">% נשארת שער </w:t>
+        <w:t xml:space="preserve"> בשלושת המסכים; זו ראיית </w:t>
+      </w:r>
+      <w:r>
+        <w:rPr>
+          <w:rFonts w:ascii="Consolas" w:hAnsi="Consolas" w:cs="Consolas"/>
+          <w:lang w:val="he-IL"/>
+          <w:color w:val="1F4E79"/>
+          <w:rtl w:val="0"/>
+        </w:rPr>
+        <w:t>OWNER_REPORTED</w:t>
       </w:r>
       <w:r>
         <w:rPr>
           <w:rFonts w:ascii="Arial" w:hAnsi="Arial" w:cs="Arial"/>
           <w:lang w:val="he-IL"/>
+          <w:rtl w:val="1"/>
+        </w:rPr>
+        <w:t xml:space="preserve">, לא </w:t>
+      </w:r>
+      <w:r>
+        <w:rPr>
+          <w:rFonts w:ascii="Arial" w:hAnsi="Arial" w:cs="Arial"/>
+          <w:lang w:val="he-IL"/>
           <w:rtl w:val="0"/>
         </w:rPr>
-        <w:t>owner</w:t>
+        <w:t>CSS</w:t>
       </w:r>
       <w:r>
         <w:rPr>
           <w:rFonts w:ascii="Arial" w:hAnsi="Arial" w:cs="Arial"/>
           <w:lang w:val="he-IL"/>
+          <w:rtl w:val="0"/>
+        </w:rPr>
+        <w:t xml:space="preserve"> </w:t>
+      </w:r>
+      <w:r>
+        <w:rPr>
+          <w:rFonts w:ascii="Arial" w:hAnsi="Arial" w:cs="Arial"/>
+          <w:lang w:val="he-IL"/>
+          <w:rtl w:val="0"/>
+        </w:rPr>
+        <w:t>zoom</w:t>
+      </w:r>
+      <w:r>
+        <w:rPr>
+          <w:rFonts w:ascii="Arial" w:hAnsi="Arial" w:cs="Arial"/>
+          <w:lang w:val="he-IL"/>
           <w:rtl w:val="1"/>
         </w:rPr>
-        <w:t xml:space="preserve"> מתועד ואינה מוחלפת ב־</w:t>
+        <w:t xml:space="preserve"> ולא תצפית </w:t>
       </w:r>
       <w:r>
         <w:rPr>
@@ -3710,23 +3874,7 @@
           <w:lang w:val="he-IL"/>
           <w:rtl w:val="0"/>
         </w:rPr>
-        <w:t>CSS</w:t>
-      </w:r>
-      <w:r>
-        <w:rPr>
-          <w:rFonts w:ascii="Arial" w:hAnsi="Arial" w:cs="Arial"/>
-          <w:lang w:val="he-IL"/>
-          <w:rtl w:val="0"/>
-        </w:rPr>
-        <w:t xml:space="preserve"> </w:t>
-      </w:r>
-      <w:r>
-        <w:rPr>
-          <w:rFonts w:ascii="Arial" w:hAnsi="Arial" w:cs="Arial"/>
-          <w:lang w:val="he-IL"/>
-          <w:rtl w:val="0"/>
-        </w:rPr>
-        <w:t>zoom.</w:t>
+        <w:t>agent.</w:t>
       </w:r>
     </w:p>
     <w:p>
@@ -4579,9 +4727,20 @@
                 <w:b w:val="0"/>
                 <w:color w:val="202A35"/>
                 <w:sz w:val="18"/>
+                <w:rtl w:val="0"/>
+              </w:rPr>
+              <w:t>closeout</w:t>
+            </w:r>
+            <w:r>
+              <w:rPr>
+                <w:rFonts w:ascii="Arial" w:hAnsi="Arial" w:cs="Arial"/>
+                <w:lang w:val="he-IL"/>
+                <w:b w:val="0"/>
+                <w:color w:val="202A35"/>
+                <w:sz w:val="18"/>
                 <w:rtl w:val="1"/>
               </w:rPr>
-              <w:t>חזרה ותיקוני חסימה</w:t>
+              <w:t xml:space="preserve"> ותיקוני חסימה</w:t>
             </w:r>
           </w:p>
         </w:tc>
@@ -4612,7 +4771,7 @@
                 <w:sz w:val="18"/>
                 <w:rtl w:val="1"/>
               </w:rPr>
-              <w:t xml:space="preserve">חזרה אנושית של </w:t>
+              <w:t xml:space="preserve">החזרה האנושית נסגרה בדיווח </w:t>
             </w:r>
             <w:r>
               <w:rPr>
@@ -4623,7 +4782,18 @@
                 <w:sz w:val="18"/>
                 <w:rtl w:val="0"/>
               </w:rPr>
-              <w:t>10</w:t>
+              <w:t>owner</w:t>
+            </w:r>
+            <w:r>
+              <w:rPr>
+                <w:rFonts w:ascii="Arial" w:hAnsi="Arial" w:cs="Arial"/>
+                <w:lang w:val="he-IL"/>
+                <w:b w:val="0"/>
+                <w:color w:val="202A35"/>
+                <w:sz w:val="18"/>
+                <w:rtl w:val="1"/>
+              </w:rPr>
+              <w:t xml:space="preserve">; נותרו </w:t>
             </w:r>
             <w:r>
               <w:rPr>
@@ -4634,7 +4804,7 @@
                 <w:sz w:val="18"/>
                 <w:rtl w:val="0"/>
               </w:rPr>
-              <w:t>–</w:t>
+              <w:t>final</w:t>
             </w:r>
             <w:r>
               <w:rPr>
@@ -4645,7 +4815,18 @@
                 <w:sz w:val="18"/>
                 <w:rtl w:val="0"/>
               </w:rPr>
-              <w:t>15</w:t>
+              <w:t xml:space="preserve"> </w:t>
+            </w:r>
+            <w:r>
+              <w:rPr>
+                <w:rFonts w:ascii="Arial" w:hAnsi="Arial" w:cs="Arial"/>
+                <w:lang w:val="he-IL"/>
+                <w:b w:val="0"/>
+                <w:color w:val="202A35"/>
+                <w:sz w:val="18"/>
+                <w:rtl w:val="0"/>
+              </w:rPr>
+              <w:t>Production/Public</w:t>
             </w:r>
             <w:r>
               <w:rPr>
@@ -4656,7 +4837,7 @@
                 <w:sz w:val="18"/>
                 <w:rtl w:val="1"/>
               </w:rPr>
-              <w:t xml:space="preserve"> דקות ורשימת הגשה סגורה</w:t>
+              <w:t xml:space="preserve"> ותיק ההגשה</w:t>
             </w:r>
           </w:p>
         </w:tc>
@@ -5780,7 +5961,7 @@
         <w:sz w:val="18"/>
         <w:rtl w:val="0"/>
       </w:rPr>
-      <w:t>v1.3</w:t>
+      <w:t>v1.4</w:t>
     </w:r>
     <w:r>
       <w:rPr>
@@ -5800,7 +5981,7 @@
         <w:sz w:val="18"/>
         <w:rtl w:val="0"/>
       </w:rPr>
-      <w:t>27.8.2026</w:t>
+      <w:t>30.8.2026</w:t>
     </w:r>
     <w:r>
       <w:rPr>

</xml_diff>